<commit_message>
Finalise the paper: journal reference style, CI facts, cover letter and checklist
- Numbered references in the journal's author-initials format (taken from its Instruction page),
  in order of first citation; UK English proofing language; long tables may break across pages.
- Results cited in Table 17 refreshed: CI run 5 on d46f67c (all four jobs passed), 564 backend tests.
- Cover letter without footer; research README documents the registry-model prerequisite.
- Prose tightened after a Word spelling and grammar pass; PDF and .docx regenerated.

Co-Authored-By: Claude Sonnet 5.5 <noreply@anthropic.com>
</commit_message>
<xml_diff>
--- a/research/paper/cover_letter.docx
+++ b/research/paper/cover_letter.docx
@@ -347,101 +347,11 @@
 </file>
 
 <file path=word/footer1.xml><?xml version="1.0" encoding="utf-8"?>
-<w:ftr xmlns:wpc="http://schemas.microsoft.com/office/word/2010/wordprocessingCanvas" xmlns:mc="http://schemas.openxmlformats.org/markup-compatibility/2006" xmlns:o="urn:schemas-microsoft-com:office:office" xmlns:r="http://schemas.openxmlformats.org/officeDocument/2006/relationships" xmlns:m="http://schemas.openxmlformats.org/officeDocument/2006/math" xmlns:v="urn:schemas-microsoft-com:vml" xmlns:wp14="http://schemas.microsoft.com/office/word/2010/wordprocessingDrawing" xmlns:wp="http://schemas.openxmlformats.org/drawingml/2006/wordprocessingDrawing" xmlns:w10="urn:schemas-microsoft-com:office:word" xmlns:w="http://schemas.openxmlformats.org/wordprocessingml/2006/main" xmlns:w14="http://schemas.microsoft.com/office/word/2010/wordml" xmlns:w15="http://schemas.microsoft.com/office/word/2012/wordml" xmlns:wpg="http://schemas.microsoft.com/office/word/2010/wordprocessingGroup" xmlns:wpi="http://schemas.microsoft.com/office/word/2010/wordprocessingInk" xmlns:wne="http://schemas.microsoft.com/office/word/2006/wordml" xmlns:wps="http://schemas.microsoft.com/office/word/2010/wordprocessingShape">
-  <w:p>
-    <w:pPr>
-      <w:jc w:val="center"/>
-    </w:pPr>
-    <w:r>
-      <w:rPr>
-        <w:rFonts w:ascii="Times New Roman" w:cs="Times New Roman" w:eastAsia="Times New Roman" w:hAnsi="Times New Roman"/>
-        <w:sz w:val="20"/>
-        <w:szCs w:val="20"/>
-      </w:rPr>
-      <w:fldChar w:fldCharType="begin"/>
-    </w:r>
-    <w:r>
-      <w:rPr>
-        <w:rFonts w:ascii="Times New Roman" w:cs="Times New Roman" w:eastAsia="Times New Roman" w:hAnsi="Times New Roman"/>
-        <w:sz w:val="20"/>
-        <w:szCs w:val="20"/>
-      </w:rPr>
-      <w:instrText xml:space="preserve">PAGE</w:instrText>
-    </w:r>
-    <w:r>
-      <w:rPr>
-        <w:rFonts w:ascii="Times New Roman" w:cs="Times New Roman" w:eastAsia="Times New Roman" w:hAnsi="Times New Roman"/>
-        <w:sz w:val="20"/>
-        <w:szCs w:val="20"/>
-      </w:rPr>
-      <w:fldChar w:fldCharType="separate"/>
-    </w:r>
-    <w:r>
-      <w:rPr>
-        <w:rFonts w:ascii="Times New Roman" w:cs="Times New Roman" w:eastAsia="Times New Roman" w:hAnsi="Times New Roman"/>
-        <w:sz w:val="20"/>
-        <w:szCs w:val="20"/>
-      </w:rPr>
-      <w:fldChar w:fldCharType="end"/>
-    </w:r>
-  </w:p>
-</w:ftr>
+<w:ftr xmlns:wpc="http://schemas.microsoft.com/office/word/2010/wordprocessingCanvas" xmlns:mc="http://schemas.openxmlformats.org/markup-compatibility/2006" xmlns:o="urn:schemas-microsoft-com:office:office" xmlns:r="http://schemas.openxmlformats.org/officeDocument/2006/relationships" xmlns:m="http://schemas.openxmlformats.org/officeDocument/2006/math" xmlns:v="urn:schemas-microsoft-com:vml" xmlns:wp14="http://schemas.microsoft.com/office/word/2010/wordprocessingDrawing" xmlns:wp="http://schemas.openxmlformats.org/drawingml/2006/wordprocessingDrawing" xmlns:w10="urn:schemas-microsoft-com:office:word" xmlns:w="http://schemas.openxmlformats.org/wordprocessingml/2006/main" xmlns:w14="http://schemas.microsoft.com/office/word/2010/wordml" xmlns:w15="http://schemas.microsoft.com/office/word/2012/wordml" xmlns:wpg="http://schemas.microsoft.com/office/word/2010/wordprocessingGroup" xmlns:wpi="http://schemas.microsoft.com/office/word/2010/wordprocessingInk" xmlns:wne="http://schemas.microsoft.com/office/word/2006/wordml" xmlns:wps="http://schemas.microsoft.com/office/word/2010/wordprocessingShape"/>
 </file>
 
 <file path=word/footer2.xml><?xml version="1.0" encoding="utf-8"?>
-<w:ftr xmlns:wpc="http://schemas.microsoft.com/office/word/2010/wordprocessingCanvas" xmlns:mc="http://schemas.openxmlformats.org/markup-compatibility/2006" xmlns:o="urn:schemas-microsoft-com:office:office" xmlns:r="http://schemas.openxmlformats.org/officeDocument/2006/relationships" xmlns:m="http://schemas.openxmlformats.org/officeDocument/2006/math" xmlns:v="urn:schemas-microsoft-com:vml" xmlns:wp14="http://schemas.microsoft.com/office/word/2010/wordprocessingDrawing" xmlns:wp="http://schemas.openxmlformats.org/drawingml/2006/wordprocessingDrawing" xmlns:w10="urn:schemas-microsoft-com:office:word" xmlns:w="http://schemas.openxmlformats.org/wordprocessingml/2006/main" xmlns:w14="http://schemas.microsoft.com/office/word/2010/wordml" xmlns:w15="http://schemas.microsoft.com/office/word/2012/wordml" xmlns:wpg="http://schemas.microsoft.com/office/word/2010/wordprocessingGroup" xmlns:wpi="http://schemas.microsoft.com/office/word/2010/wordprocessingInk" xmlns:wne="http://schemas.microsoft.com/office/word/2006/wordml" xmlns:wps="http://schemas.microsoft.com/office/word/2010/wordprocessingShape">
-  <w:p>
-    <w:pPr>
-      <w:pBdr>
-        <w:top w:val="single" w:color="000000" w:sz="4" w:space="4"/>
-      </w:pBdr>
-      <w:spacing w:after="20" w:before="0"/>
-    </w:pPr>
-  </w:p>
-  <w:p>
-    <w:pPr>
-      <w:spacing w:after="10" w:before="0" w:line="240"/>
-      <w:jc w:val="left"/>
-    </w:pPr>
-  </w:p>
-  <w:p>
-    <w:pPr>
-      <w:jc w:val="center"/>
-    </w:pPr>
-    <w:r>
-      <w:rPr>
-        <w:rFonts w:ascii="Times New Roman" w:cs="Times New Roman" w:eastAsia="Times New Roman" w:hAnsi="Times New Roman"/>
-        <w:sz w:val="20"/>
-        <w:szCs w:val="20"/>
-      </w:rPr>
-      <w:fldChar w:fldCharType="begin"/>
-    </w:r>
-    <w:r>
-      <w:rPr>
-        <w:rFonts w:ascii="Times New Roman" w:cs="Times New Roman" w:eastAsia="Times New Roman" w:hAnsi="Times New Roman"/>
-        <w:sz w:val="20"/>
-        <w:szCs w:val="20"/>
-      </w:rPr>
-      <w:instrText xml:space="preserve">PAGE</w:instrText>
-    </w:r>
-    <w:r>
-      <w:rPr>
-        <w:rFonts w:ascii="Times New Roman" w:cs="Times New Roman" w:eastAsia="Times New Roman" w:hAnsi="Times New Roman"/>
-        <w:sz w:val="20"/>
-        <w:szCs w:val="20"/>
-      </w:rPr>
-      <w:fldChar w:fldCharType="separate"/>
-    </w:r>
-    <w:r>
-      <w:rPr>
-        <w:rFonts w:ascii="Times New Roman" w:cs="Times New Roman" w:eastAsia="Times New Roman" w:hAnsi="Times New Roman"/>
-        <w:sz w:val="20"/>
-        <w:szCs w:val="20"/>
-      </w:rPr>
-      <w:fldChar w:fldCharType="end"/>
-    </w:r>
-  </w:p>
-</w:ftr>
+<w:ftr xmlns:wpc="http://schemas.microsoft.com/office/word/2010/wordprocessingCanvas" xmlns:mc="http://schemas.openxmlformats.org/markup-compatibility/2006" xmlns:o="urn:schemas-microsoft-com:office:office" xmlns:r="http://schemas.openxmlformats.org/officeDocument/2006/relationships" xmlns:m="http://schemas.openxmlformats.org/officeDocument/2006/math" xmlns:v="urn:schemas-microsoft-com:vml" xmlns:wp14="http://schemas.microsoft.com/office/word/2010/wordprocessingDrawing" xmlns:wp="http://schemas.openxmlformats.org/drawingml/2006/wordprocessingDrawing" xmlns:w10="urn:schemas-microsoft-com:office:word" xmlns:w="http://schemas.openxmlformats.org/wordprocessingml/2006/main" xmlns:w14="http://schemas.microsoft.com/office/word/2010/wordml" xmlns:w15="http://schemas.microsoft.com/office/word/2012/wordml" xmlns:wpg="http://schemas.microsoft.com/office/word/2010/wordprocessingGroup" xmlns:wpi="http://schemas.microsoft.com/office/word/2010/wordprocessingInk" xmlns:wne="http://schemas.microsoft.com/office/word/2006/wordml" xmlns:wps="http://schemas.microsoft.com/office/word/2010/wordprocessingShape"/>
 </file>
 
 <file path=word/footnotes.xml><?xml version="1.0" encoding="utf-8"?>

</xml_diff>